<commit_message>
Fase 2: actualiza Gestor SSCC a la version del 23-10
</commit_message>
<xml_diff>
--- a/Fase 2/Evidencias Proyecto/Evidencias de sistema/Aplicación/duoc/calidad/Plan de Gestión de Cambios.docx
+++ b/Fase 2/Evidencias Proyecto/Evidencias de sistema/Aplicación/duoc/calidad/Plan de Gestión de Cambios.docx
@@ -21,7 +21,7 @@
         </w:pBdr>
       </w:pPr>
       <w:r>
-        <w:t xml:space="preserve">Nota metodológica: Empresa Demo </w:t>
+        <w:t xml:space="preserve">Nota metodológica: Volvo </w:t>
       </w:r>
       <w:proofErr w:type="spellStart"/>
       <w:r>
@@ -146,7 +146,7 @@
         </w:pBdr>
       </w:pPr>
       <w:r>
-        <w:t xml:space="preserve">Establecer el procedimiento estándar para solicitar, evaluar, aprobar e implementar cambios en el código, arquitectura o configuraciones operativas de Empresa Demo </w:t>
+        <w:t xml:space="preserve">Establecer el procedimiento estándar para solicitar, evaluar, aprobar e implementar cambios en el código, arquitectura o configuraciones operativas de Volvo </w:t>
       </w:r>
       <w:proofErr w:type="spellStart"/>
       <w:r>
@@ -277,7 +277,7 @@
         <w:rPr>
           <w:bCs/>
         </w:rPr>
-        <w:t>QA: la validación de cada cambio se ejecuta mediante la batería automatizada existente (1275 pruebas a la fecha de este documento, ver Plan de Pruebas) y el auditor propio del proyecto (src/tests/auditor/run_auditor.py), no mediante un rol de QA humano diferenciado y documentado como tal.</w:t>
+        <w:t>QA: la validación de cada cambio se ejecuta mediante la batería automatizada existente (1270 pruebas a la fecha de este documento, ver Plan de Pruebas) y el auditor propio del proyecto (src/tests/auditor/run_auditor.py), no mediante un rol de QA humano diferenciado y documentado como tal.</w:t>
       </w:r>
       <w:proofErr w:type="spellStart"/>
       <w:r>
@@ -676,7 +676,7 @@
         <w:rPr>
           <w:bCs/>
         </w:rPr>
-        <w:t>Dashboard_anterior</w:t>
+        <w:t>Volvo_Dashboard</w:t>
       </w:r>
       <w:proofErr w:type="spellEnd"/>
       <w:r>
@@ -805,7 +805,7 @@
         </w:pBdr>
       </w:pPr>
       <w:r>
-        <w:t>0 regresiones en la batería completa de pruebas automatizadas (1275 casos a la fecha de este documento, ver Plan de Pruebas y Reporte de Ejecución de Pruebas); impacto validado explícitamente sobre las dependencias documentadas de Excel/SharePoint cuando el cambio las toca (ver docs/05 y docs/06); actualización de la documentación funcional afectada en /docs cuando el cambio altera comportamiento ya documentado (ver CLAUDE.md §3); y, cuando el cambio introduce o modifica lógica de negocio, al menos un caso de prueba automatizado dedicado (patrón real observado: 56 pruebas nuevas para la separación de Provisiones, 10 para el alta de contacto en línea desde Correos, 17 para la regresión de cálculo de fechas — ver docs/06 §11 y Reporte de Defectos, BUG-002).</w:t>
+        <w:t>0 regresiones en la batería completa de pruebas automatizadas (1270 casos a la fecha de este documento, ver Plan de Pruebas y Reporte de Ejecución de Pruebas); impacto validado explícitamente sobre las dependencias documentadas de Excel/SharePoint cuando el cambio las toca (ver docs/05 y docs/06); actualización de la documentación funcional afectada en /docs cuando el cambio altera comportamiento ya documentado (ver CLAUDE.md §3); y, cuando el cambio introduce o modifica lógica de negocio, al menos un caso de prueba automatizado dedicado (patrón real observado: 56 pruebas nuevas para la separación de Provisiones, 10 para el alta de contacto en línea desde Correos, 17 para la regresión de cálculo de fechas — ver docs/06 §11 y Reporte de Defectos, BUG-002).</w:t>
       </w:r>
       <w:proofErr w:type="spellStart"/>
       <w:r/>

</xml_diff>